<commit_message>
Actualiza inicio, documentación y firmware del invernadero
</commit_message>
<xml_diff>
--- a/docs/Informe-Control-Invernadero.docx
+++ b/docs/Informe-Control-Invernadero.docx
@@ -40,7 +40,7 @@
         <w:rPr>
           <w:b/>
         </w:rPr>
-        <w:t xml:space="preserve">Instituto Superior Tecnológico Inmaculada Concepción (ISTIC)  </w:t>
+        <w:t>Instituto Superior Tecnológico Inmaculada Concepción (ISTIC)</w:t>
       </w:r>
     </w:p>
     <w:p>
@@ -55,7 +55,7 @@
         <w:rPr>
           <w:b/>
         </w:rPr>
-        <w:t xml:space="preserve">Tecnicatura Superior en Análisis de Sistemas  </w:t>
+        <w:t>Tecnicatura Superior en Análisis de Sistemas</w:t>
       </w:r>
     </w:p>
     <w:p>
@@ -70,7 +70,7 @@
         <w:rPr>
           <w:b/>
         </w:rPr>
-        <w:t xml:space="preserve">Asignatura: Integración de Tecnologías (IN-TE-A)  </w:t>
+        <w:t>Asignatura: Integración de Tecnologías (IN-TE-A)</w:t>
       </w:r>
     </w:p>
     <w:p>
@@ -79,7 +79,7 @@
         <w:jc w:val="center"/>
       </w:pPr>
       <w:r>
-        <w:t xml:space="preserve">Comisión: A Única  </w:t>
+        <w:t>Comisión: A Única</w:t>
       </w:r>
     </w:p>
     <w:p>
@@ -94,7 +94,7 @@
         <w:rPr>
           <w:b/>
         </w:rPr>
-        <w:t xml:space="preserve">Profesor: Carlos F. Gorosito  </w:t>
+        <w:t>Profesor: Carlos F. Gorosito</w:t>
       </w:r>
     </w:p>
     <w:p>
@@ -109,7 +109,7 @@
         <w:rPr>
           <w:b/>
         </w:rPr>
-        <w:t xml:space="preserve">Integrantes: [COMPLETAR NOMBRES Y APELLIDOS]  </w:t>
+        <w:t>Integrantes: [COMPLETAR NOMBRES Y APELLIDOS]</w:t>
       </w:r>
     </w:p>
     <w:p>
@@ -124,7 +124,7 @@
         <w:rPr>
           <w:b/>
         </w:rPr>
-        <w:t xml:space="preserve">Fecha de entrega: 22 de junio de 2026  </w:t>
+        <w:t>Fecha de entrega: 22 de junio de 2026</w:t>
       </w:r>
     </w:p>
     <w:p>
@@ -187,7 +187,6 @@
           <w:b/>
           <w:sz w:val="32"/>
         </w:rPr>
-        <w:lastRenderedPageBreak/>
         <w:t>1. Introducción</w:t>
       </w:r>
     </w:p>
@@ -404,7 +403,6 @@
         <w:spacing w:after="100" w:line="240" w:lineRule="auto"/>
       </w:pPr>
       <w:r>
-        <w:lastRenderedPageBreak/>
         <w:t>La sesión PHP evita que una persona sin autenticar abra directamente el puente serial. Las credenciales actuales (abc / 1234) son académicas y están incorporadas en el código; no son adecuadas para producción.</w:t>
       </w:r>
     </w:p>
@@ -4965,7 +4963,7 @@
         <w:spacing w:after="100" w:line="240" w:lineRule="auto"/>
       </w:pPr>
       <w:r>
-        <w:t>2. Ejecutar npm install la primera vez.</w:t>
+        <w:t>2. Ejecutar .\iniciar.bat; la primera vez instalará las dependencias y luego</w:t>
       </w:r>
     </w:p>
     <w:p>
@@ -4973,7 +4971,7 @@
         <w:spacing w:after="100" w:line="240" w:lineRule="auto"/>
       </w:pPr>
       <w:r>
-        <w:t>3. Iniciar node server.js.</w:t>
+        <w:t xml:space="preserve">   iniciará PHP y Socket.IO conjuntamente.</w:t>
       </w:r>
     </w:p>
     <w:p>
@@ -4981,7 +4979,7 @@
         <w:spacing w:after="100" w:line="240" w:lineRule="auto"/>
       </w:pPr>
       <w:r>
-        <w:t>4. Iniciar php -S 127.0.0.1:8000 en otra terminal.</w:t>
+        <w:t>3. Abrir http://localhost:8000 en Chrome o Edge.</w:t>
       </w:r>
     </w:p>
     <w:p>
@@ -4989,7 +4987,7 @@
         <w:spacing w:after="100" w:line="240" w:lineRule="auto"/>
       </w:pPr>
       <w:r>
-        <w:t>5. Abrir http://127.0.0.1:8000/index.php en Chrome o Edge.</w:t>
+        <w:t>4. Ingresar con abc y 1234.</w:t>
       </w:r>
     </w:p>
     <w:p>
@@ -4997,7 +4995,7 @@
         <w:spacing w:after="100" w:line="240" w:lineRule="auto"/>
       </w:pPr>
       <w:r>
-        <w:t>6. Ingresar con abc y 1234.</w:t>
+        <w:t>5. Abrir el puente, presionar Conectar y seleccionar el puerto.</w:t>
       </w:r>
     </w:p>
     <w:p>
@@ -5005,7 +5003,7 @@
         <w:spacing w:after="100" w:line="240" w:lineRule="auto"/>
       </w:pPr>
       <w:r>
-        <w:t>7. Abrir el puente, presionar Conectar y seleccionar el puerto.</w:t>
+        <w:t>6. Regresar al dashboard para observar medidas y estados.</w:t>
       </w:r>
     </w:p>
     <w:p>
@@ -5013,7 +5011,7 @@
         <w:spacing w:after="100" w:line="240" w:lineRule="auto"/>
       </w:pPr>
       <w:r>
-        <w:t>8. Regresar al dashboard para observar medidas y estados.</w:t>
+        <w:t>7. Al finalizar, desconectar el puerto, cerrar sesión y presionar Ctrl+C en</w:t>
       </w:r>
     </w:p>
     <w:p>
@@ -5021,7 +5019,23 @@
         <w:spacing w:after="100" w:line="240" w:lineRule="auto"/>
       </w:pPr>
       <w:r>
-        <w:t>9. Al finalizar, desconectar el puerto, cerrar sesión y detener ambos servidores.</w:t>
+        <w:t xml:space="preserve">   la ventana del iniciador.</w:t>
+      </w:r>
+    </w:p>
+    <w:p>
+      <w:pPr>
+        <w:spacing w:after="100" w:line="240" w:lineRule="auto"/>
+      </w:pPr>
+      <w:r>
+        <w:t>Si Windows no encuentra PHP, se instala con winget install PHP.PHP.8.4. Luego</w:t>
+      </w:r>
+    </w:p>
+    <w:p>
+      <w:pPr>
+        <w:spacing w:after="100" w:line="240" w:lineRule="auto"/>
+      </w:pPr>
+      <w:r>
+        <w:t>se debe volver a abrir PowerShell y ejecutar .\iniciar.bat.</w:t>
       </w:r>
     </w:p>
     <w:p>
@@ -5697,7 +5711,7 @@
         <w:noProof/>
         <w:sz w:val="18"/>
       </w:rPr>
-      <w:t>3</w:t>
+      <w:t>1</w:t>
     </w:r>
     <w:r>
       <w:rPr>
@@ -5734,7 +5748,7 @@
         <w:noProof/>
         <w:sz w:val="18"/>
       </w:rPr>
-      <w:t>3</w:t>
+      <w:t>1</w:t>
     </w:r>
     <w:r>
       <w:rPr>
@@ -6032,7 +6046,7 @@
     <w:link w:val="EncabezadoCar"/>
     <w:uiPriority w:val="99"/>
     <w:unhideWhenUsed/>
-    <w:rsid w:val="00DA5BE1"/>
+    <w:rsid w:val="002674C4"/>
     <w:pPr>
       <w:tabs>
         <w:tab w:val="center" w:pos="4252"/>
@@ -6046,7 +6060,7 @@
     <w:basedOn w:val="Fuentedeprrafopredeter"/>
     <w:link w:val="Encabezado"/>
     <w:uiPriority w:val="99"/>
-    <w:rsid w:val="00DA5BE1"/>
+    <w:rsid w:val="002674C4"/>
     <w:rPr>
       <w:rFonts w:ascii="Arial" w:hAnsi="Arial" w:cs="Arial"/>
     </w:rPr>
@@ -6057,7 +6071,7 @@
     <w:link w:val="PiedepginaCar"/>
     <w:uiPriority w:val="99"/>
     <w:unhideWhenUsed/>
-    <w:rsid w:val="00DA5BE1"/>
+    <w:rsid w:val="002674C4"/>
     <w:pPr>
       <w:tabs>
         <w:tab w:val="center" w:pos="4252"/>
@@ -6071,7 +6085,7 @@
     <w:basedOn w:val="Fuentedeprrafopredeter"/>
     <w:link w:val="Piedepgina"/>
     <w:uiPriority w:val="99"/>
-    <w:rsid w:val="00DA5BE1"/>
+    <w:rsid w:val="002674C4"/>
     <w:rPr>
       <w:rFonts w:ascii="Arial" w:hAnsi="Arial" w:cs="Arial"/>
     </w:rPr>
@@ -6275,7 +6289,7 @@
     <w:link w:val="EncabezadoCar"/>
     <w:uiPriority w:val="99"/>
     <w:unhideWhenUsed/>
-    <w:rsid w:val="00DA5BE1"/>
+    <w:rsid w:val="002674C4"/>
     <w:pPr>
       <w:tabs>
         <w:tab w:val="center" w:pos="4252"/>
@@ -6289,7 +6303,7 @@
     <w:basedOn w:val="Fuentedeprrafopredeter"/>
     <w:link w:val="Encabezado"/>
     <w:uiPriority w:val="99"/>
-    <w:rsid w:val="00DA5BE1"/>
+    <w:rsid w:val="002674C4"/>
     <w:rPr>
       <w:rFonts w:ascii="Arial" w:hAnsi="Arial" w:cs="Arial"/>
     </w:rPr>
@@ -6300,7 +6314,7 @@
     <w:link w:val="PiedepginaCar"/>
     <w:uiPriority w:val="99"/>
     <w:unhideWhenUsed/>
-    <w:rsid w:val="00DA5BE1"/>
+    <w:rsid w:val="002674C4"/>
     <w:pPr>
       <w:tabs>
         <w:tab w:val="center" w:pos="4252"/>
@@ -6314,7 +6328,7 @@
     <w:basedOn w:val="Fuentedeprrafopredeter"/>
     <w:link w:val="Piedepgina"/>
     <w:uiPriority w:val="99"/>
-    <w:rsid w:val="00DA5BE1"/>
+    <w:rsid w:val="002674C4"/>
     <w:rPr>
       <w:rFonts w:ascii="Arial" w:hAnsi="Arial" w:cs="Arial"/>
     </w:rPr>

</xml_diff>